<commit_message>
Expand condensed version: definitions, backgrounds, new formats, RCEP results, more terms
Co-authored-by: bellepesenok <bellepesenok@users.noreply.github.com>
</commit_message>
<xml_diff>
--- a/对外贸易发展战略_精简速记版.docx
+++ b/对外贸易发展战略_精简速记版.docx
@@ -49,6 +49,111 @@
       </w:r>
     </w:p>
     <w:p/>
+    <w:p>
+      <w:pPr>
+        <w:spacing w:before="240"/>
+        <w:pBdr>
+          <w:bottom w:val="single" w:sz="10" w:space="3" w:color="8B0000"/>
+        </w:pBdr>
+      </w:pPr>
+      <w:r>
+        <w:rPr>
+          <w:rFonts w:ascii="Calibri" w:hAnsi="Calibri" w:eastAsia="Microsoft YaHei"/>
+          <w:b/>
+          <w:i w:val="0"/>
+          <w:color w:val="8B0000"/>
+          <w:sz w:val="32"/>
+        </w:rPr>
+        <w:t>引言</w:t>
+      </w:r>
+      <w:r>
+        <w:rPr>
+          <w:rFonts w:ascii="Calibri" w:hAnsi="Calibri" w:eastAsia="Microsoft YaHei"/>
+          <w:b w:val="0"/>
+          <w:i/>
+          <w:color w:val="555555"/>
+          <w:sz w:val="20"/>
+        </w:rPr>
+        <w:t xml:space="preserve">  · Введение: место внешней торговли</w:t>
+      </w:r>
+    </w:p>
+    <w:p>
+      <w:pPr>
+        <w:pStyle w:val="ListBullet"/>
+        <w:spacing w:after="20"/>
+        <w:ind w:left="312"/>
+      </w:pPr>
+      <w:r>
+        <w:rPr>
+          <w:rFonts w:ascii="Calibri" w:hAnsi="Calibri" w:eastAsia="Microsoft YaHei"/>
+          <w:b w:val="0"/>
+          <w:i w:val="0"/>
+          <w:sz w:val="22"/>
+        </w:rPr>
+        <w:t>地位上升：从国民经济“调节余缺”的辅助地位 → 影响改革开放进程的战略地位</w:t>
+      </w:r>
+    </w:p>
+    <w:p>
+      <w:pPr>
+        <w:pStyle w:val="ListBullet"/>
+        <w:spacing w:after="20"/>
+        <w:ind w:left="312"/>
+      </w:pPr>
+      <w:r>
+        <w:rPr>
+          <w:rFonts w:ascii="Calibri" w:hAnsi="Calibri" w:eastAsia="Microsoft YaHei"/>
+          <w:b w:val="0"/>
+          <w:i w:val="0"/>
+          <w:sz w:val="22"/>
+        </w:rPr>
+        <w:t>成就来源：实行对外开放政策 + 成功实施对外贸易发展战略</w:t>
+      </w:r>
+    </w:p>
+    <w:p>
+      <w:pPr>
+        <w:pStyle w:val="ListBullet"/>
+        <w:spacing w:after="20"/>
+        <w:ind w:left="312"/>
+      </w:pPr>
+      <w:r>
+        <w:rPr>
+          <w:rFonts w:ascii="Calibri" w:hAnsi="Calibri" w:eastAsia="Microsoft YaHei"/>
+          <w:b w:val="0"/>
+          <w:i w:val="0"/>
+          <w:sz w:val="22"/>
+        </w:rPr>
+        <w:t>国家战略：把握国际趋势 → 发挥比较优势、打造竞争优势 → 推动快速发展与结构升级</w:t>
+      </w:r>
+    </w:p>
+    <w:p>
+      <w:pPr>
+        <w:spacing w:before="60" w:after="140"/>
+        <w:shd w:val="clear" w:color="auto" w:fill="EAF3EC"/>
+        <w:pBdr>
+          <w:left w:val="single" w:sz="20" w:space="8" w:color="1A4D2E"/>
+        </w:pBdr>
+      </w:pPr>
+      <w:r>
+        <w:rPr>
+          <w:rFonts w:ascii="Calibri" w:hAnsi="Calibri" w:eastAsia="Microsoft YaHei"/>
+          <w:b/>
+          <w:i w:val="0"/>
+          <w:color w:val="1A4D2E"/>
+          <w:sz w:val="20"/>
+        </w:rPr>
+        <w:t xml:space="preserve">💡 </w:t>
+      </w:r>
+      <w:r>
+        <w:rPr>
+          <w:rFonts w:ascii="Calibri" w:hAnsi="Calibri" w:eastAsia="Microsoft YaHei"/>
+          <w:b w:val="0"/>
+          <w:i w:val="0"/>
+          <w:color w:val="202020"/>
+          <w:sz w:val="20"/>
+        </w:rPr>
+        <w:t>После 改革开放 (реформы и открытость, с 1978) внешняя торговля прошла путь от вспомогательной роли «латать дыры» (调节余缺) до СТРАТЕГИЧЕСКОГО фактора. 比较优势 — что страна умеет делать дешевле (сырьё, дешёвый труд); 竞争优势 — то, что создают целенаправленно (технологии, бренды, качество).</w:t>
+      </w:r>
+    </w:p>
     <w:p>
       <w:pPr>
         <w:spacing w:before="240"/>
@@ -235,6 +340,69 @@
     </w:p>
     <w:p>
       <w:pPr>
+        <w:spacing w:before="160" w:after="40"/>
+      </w:pPr>
+      <w:r>
+        <w:rPr>
+          <w:rFonts w:ascii="Calibri" w:hAnsi="Calibri" w:eastAsia="Microsoft YaHei"/>
+          <w:b/>
+          <w:i w:val="0"/>
+          <w:color w:val="B03010"/>
+          <w:sz w:val="25"/>
+        </w:rPr>
+        <w:t>答题三主线（каждую стратегию разбираем так）</w:t>
+      </w:r>
+    </w:p>
+    <w:p>
+      <w:pPr>
+        <w:pStyle w:val="ListBullet"/>
+        <w:spacing w:after="20"/>
+        <w:ind w:left="312"/>
+      </w:pPr>
+      <w:r>
+        <w:rPr>
+          <w:rFonts w:ascii="Calibri" w:hAnsi="Calibri" w:eastAsia="Microsoft YaHei"/>
+          <w:b w:val="0"/>
+          <w:i w:val="0"/>
+          <w:sz w:val="22"/>
+        </w:rPr>
+        <w:t>战略实施的国内外背景 — фон, почему так</w:t>
+      </w:r>
+    </w:p>
+    <w:p>
+      <w:pPr>
+        <w:pStyle w:val="ListBullet"/>
+        <w:spacing w:after="20"/>
+        <w:ind w:left="312"/>
+      </w:pPr>
+      <w:r>
+        <w:rPr>
+          <w:rFonts w:ascii="Calibri" w:hAnsi="Calibri" w:eastAsia="Microsoft YaHei"/>
+          <w:b w:val="0"/>
+          <w:i w:val="0"/>
+          <w:sz w:val="22"/>
+        </w:rPr>
+        <w:t>战略演变的依据 — на чём основано</w:t>
+      </w:r>
+    </w:p>
+    <w:p>
+      <w:pPr>
+        <w:pStyle w:val="ListBullet"/>
+        <w:spacing w:after="20"/>
+        <w:ind w:left="312"/>
+      </w:pPr>
+      <w:r>
+        <w:rPr>
+          <w:rFonts w:ascii="Calibri" w:hAnsi="Calibri" w:eastAsia="Microsoft YaHei"/>
+          <w:b w:val="0"/>
+          <w:i w:val="0"/>
+          <w:sz w:val="22"/>
+        </w:rPr>
+        <w:t>取得的成效 — какие результаты</w:t>
+      </w:r>
+    </w:p>
+    <w:p>
+      <w:pPr>
         <w:spacing w:before="60" w:after="140"/>
         <w:shd w:val="clear" w:color="auto" w:fill="EAF3EC"/>
         <w:pBdr>
@@ -259,7 +427,7 @@
           <w:color w:val="202020"/>
           <w:sz w:val="20"/>
         </w:rPr>
-        <w:t>Логика всей главы: переход ОТ дешёвого труда и сырья (比较优势) К технологиям, брендам и качеству (竞争优势). Схема ответа: 背景→依据→内容→成效.</w:t>
+        <w:t>Логика всей главы: переход ОТ дешёвого труда и сырья (比较优势) К технологиям, брендам и качеству (竞争优势). Универсальная схема развёрнутого ответа: 背景 → 依据 → 内容/措施 → 成效.</w:t>
       </w:r>
     </w:p>
     <w:p>
@@ -277,7 +445,7 @@
           <w:color w:val="8B0000"/>
           <w:sz w:val="32"/>
         </w:rPr>
-        <w:t>① 出口商品战略：按五年计划速记</w:t>
+        <w:t>① 出口商品战略</w:t>
       </w:r>
       <w:r>
         <w:rPr>
@@ -287,7 +455,80 @@
           <w:color w:val="555555"/>
           <w:sz w:val="20"/>
         </w:rPr>
-        <w:t xml:space="preserve">  · Эволюция экспорта — таблица</w:t>
+        <w:t xml:space="preserve">  · Стратегия экспортных товаров</w:t>
+      </w:r>
+    </w:p>
+    <w:p>
+      <w:pPr>
+        <w:pStyle w:val="ListBullet"/>
+        <w:spacing w:after="20"/>
+        <w:ind w:left="312"/>
+      </w:pPr>
+      <w:r>
+        <w:rPr>
+          <w:rFonts w:ascii="Calibri" w:hAnsi="Calibri" w:eastAsia="Microsoft YaHei"/>
+          <w:b/>
+          <w:i w:val="0"/>
+          <w:color w:val="8B0000"/>
+          <w:sz w:val="22"/>
+        </w:rPr>
+        <w:t>定义：</w:t>
+      </w:r>
+      <w:r>
+        <w:rPr>
+          <w:rFonts w:ascii="Calibri" w:hAnsi="Calibri" w:eastAsia="Microsoft YaHei"/>
+          <w:b w:val="0"/>
+          <w:i w:val="0"/>
+          <w:sz w:val="22"/>
+        </w:rPr>
+        <w:t>含义：根据本国比较优势/竞争优势 + 国际市场供求，对出口商品构成的战略安排（“出口什么”）</w:t>
+      </w:r>
+    </w:p>
+    <w:p>
+      <w:pPr>
+        <w:pStyle w:val="ListBullet"/>
+        <w:spacing w:after="20"/>
+        <w:ind w:left="312"/>
+      </w:pPr>
+      <w:r>
+        <w:rPr>
+          <w:rFonts w:ascii="Calibri" w:hAnsi="Calibri" w:eastAsia="Microsoft YaHei"/>
+          <w:b w:val="0"/>
+          <w:i w:val="0"/>
+          <w:sz w:val="22"/>
+        </w:rPr>
+        <w:t>影响因素(3)：国际经济环境 · 国内经济发展水平 · 产业结构</w:t>
+      </w:r>
+    </w:p>
+    <w:p>
+      <w:pPr>
+        <w:pStyle w:val="ListBullet"/>
+        <w:spacing w:after="20"/>
+        <w:ind w:left="312"/>
+      </w:pPr>
+      <w:r>
+        <w:rPr>
+          <w:rFonts w:ascii="Calibri" w:hAnsi="Calibri" w:eastAsia="Microsoft YaHei"/>
+          <w:b w:val="0"/>
+          <w:i w:val="0"/>
+          <w:sz w:val="22"/>
+        </w:rPr>
+        <w:t>意义：增强国际竞争力 · 提高创汇能力 · 扩大出口经济效益</w:t>
+      </w:r>
+    </w:p>
+    <w:p>
+      <w:pPr>
+        <w:spacing w:before="160" w:after="40"/>
+      </w:pPr>
+      <w:r>
+        <w:rPr>
+          <w:rFonts w:ascii="Calibri" w:hAnsi="Calibri" w:eastAsia="Microsoft YaHei"/>
+          <w:b/>
+          <w:i w:val="0"/>
+          <w:color w:val="B03010"/>
+          <w:sz w:val="25"/>
+        </w:rPr>
+        <w:t>按五年计划速记表</w:t>
       </w:r>
     </w:p>
     <w:tbl>
@@ -973,6 +1214,151 @@
           <w:color w:val="B03010"/>
           <w:sz w:val="25"/>
         </w:rPr>
+        <w:t>关键背景 (почему именно тогда)</w:t>
+      </w:r>
+    </w:p>
+    <w:p>
+      <w:pPr>
+        <w:pStyle w:val="ListBullet"/>
+        <w:spacing w:after="20"/>
+        <w:ind w:left="312"/>
+      </w:pPr>
+      <w:r>
+        <w:rPr>
+          <w:rFonts w:ascii="Calibri" w:hAnsi="Calibri" w:eastAsia="Microsoft YaHei"/>
+          <w:b/>
+          <w:i w:val="0"/>
+          <w:color w:val="8B0000"/>
+          <w:sz w:val="22"/>
+        </w:rPr>
+        <w:t xml:space="preserve">七五 </w:t>
+      </w:r>
+      <w:r>
+        <w:rPr>
+          <w:rFonts w:ascii="Calibri" w:hAnsi="Calibri" w:eastAsia="Microsoft YaHei"/>
+          <w:b w:val="0"/>
+          <w:i w:val="0"/>
+          <w:sz w:val="22"/>
+        </w:rPr>
+        <w:t>七五：国际初级产品价格大跌(1985-90原油暴跌)→初级品贸易萎缩、制成品增长</w:t>
+      </w:r>
+    </w:p>
+    <w:p>
+      <w:pPr>
+        <w:pStyle w:val="ListBullet"/>
+        <w:spacing w:after="20"/>
+        <w:ind w:left="312"/>
+      </w:pPr>
+      <w:r>
+        <w:rPr>
+          <w:rFonts w:ascii="Calibri" w:hAnsi="Calibri" w:eastAsia="Microsoft YaHei"/>
+          <w:b/>
+          <w:i w:val="0"/>
+          <w:color w:val="8B0000"/>
+          <w:sz w:val="22"/>
+        </w:rPr>
+        <w:t xml:space="preserve">八五 </w:t>
+      </w:r>
+      <w:r>
+        <w:rPr>
+          <w:rFonts w:ascii="Calibri" w:hAnsi="Calibri" w:eastAsia="Microsoft YaHei"/>
+          <w:b w:val="0"/>
+          <w:i w:val="0"/>
+          <w:sz w:val="22"/>
+        </w:rPr>
+        <w:t>八五：机电产品成为国际贸易额最大的一类；国内引资引技项目投产创收</w:t>
+      </w:r>
+    </w:p>
+    <w:p>
+      <w:pPr>
+        <w:pStyle w:val="ListBullet"/>
+        <w:spacing w:after="20"/>
+        <w:ind w:left="312"/>
+      </w:pPr>
+      <w:r>
+        <w:rPr>
+          <w:rFonts w:ascii="Calibri" w:hAnsi="Calibri" w:eastAsia="Microsoft YaHei"/>
+          <w:b/>
+          <w:i w:val="0"/>
+          <w:color w:val="8B0000"/>
+          <w:sz w:val="22"/>
+        </w:rPr>
+        <w:t xml:space="preserve">九五 </w:t>
+      </w:r>
+      <w:r>
+        <w:rPr>
+          <w:rFonts w:ascii="Calibri" w:hAnsi="Calibri" w:eastAsia="Microsoft YaHei"/>
+          <w:b w:val="0"/>
+          <w:i w:val="0"/>
+          <w:sz w:val="22"/>
+        </w:rPr>
+        <w:t>九五：粗放型→集约型；出口仍以低附加值劳动密集型为主、竞争力偏弱</w:t>
+      </w:r>
+    </w:p>
+    <w:p>
+      <w:pPr>
+        <w:pStyle w:val="ListBullet"/>
+        <w:spacing w:after="20"/>
+        <w:ind w:left="312"/>
+      </w:pPr>
+      <w:r>
+        <w:rPr>
+          <w:rFonts w:ascii="Calibri" w:hAnsi="Calibri" w:eastAsia="Microsoft YaHei"/>
+          <w:b/>
+          <w:i w:val="0"/>
+          <w:color w:val="8B0000"/>
+          <w:sz w:val="22"/>
+        </w:rPr>
+        <w:t xml:space="preserve">十一五 </w:t>
+      </w:r>
+      <w:r>
+        <w:rPr>
+          <w:rFonts w:ascii="Calibri" w:hAnsi="Calibri" w:eastAsia="Microsoft YaHei"/>
+          <w:b w:val="0"/>
+          <w:i w:val="0"/>
+          <w:sz w:val="22"/>
+        </w:rPr>
+        <w:t>十一五：世界第三大贸易国，但一半以上靠加工贸易、附加值低</w:t>
+      </w:r>
+    </w:p>
+    <w:p>
+      <w:pPr>
+        <w:pStyle w:val="ListBullet"/>
+        <w:spacing w:after="20"/>
+        <w:ind w:left="312"/>
+      </w:pPr>
+      <w:r>
+        <w:rPr>
+          <w:rFonts w:ascii="Calibri" w:hAnsi="Calibri" w:eastAsia="Microsoft YaHei"/>
+          <w:b/>
+          <w:i w:val="0"/>
+          <w:color w:val="8B0000"/>
+          <w:sz w:val="22"/>
+        </w:rPr>
+        <w:t xml:space="preserve">十三五 </w:t>
+      </w:r>
+      <w:r>
+        <w:rPr>
+          <w:rFonts w:ascii="Calibri" w:hAnsi="Calibri" w:eastAsia="Microsoft YaHei"/>
+          <w:b w:val="0"/>
+          <w:i w:val="0"/>
+          <w:sz w:val="22"/>
+        </w:rPr>
+        <w:t>十三五：世界经济曲折复苏、我国进入“新常态”</w:t>
+      </w:r>
+    </w:p>
+    <w:p>
+      <w:pPr>
+        <w:spacing w:before="160" w:after="40"/>
+      </w:pPr>
+      <w:r>
+        <w:rPr>
+          <w:rFonts w:ascii="Calibri" w:hAnsi="Calibri" w:eastAsia="Microsoft YaHei"/>
+          <w:b/>
+          <w:i w:val="0"/>
+          <w:color w:val="B03010"/>
+          <w:sz w:val="25"/>
+        </w:rPr>
         <w:t>重点对比：大进大出 → 优进优出</w:t>
       </w:r>
     </w:p>
@@ -989,7 +1375,7 @@
           <w:i w:val="0"/>
           <w:sz w:val="22"/>
         </w:rPr>
-        <w:t>大进大出：进口原料→国内加工→出口；中国只赚“打工者利润”</w:t>
+        <w:t>大进大出（两头在外）：进口原料→国内加工→出口；利润集中在“前头(采购)、后头(销售)”，中国只赚“打工者利润”</w:t>
       </w:r>
     </w:p>
     <w:p>
@@ -1005,7 +1391,7 @@
           <w:i w:val="0"/>
           <w:sz w:val="22"/>
         </w:rPr>
-        <w:t>优进：有选择进口紧缺的先进技术、关键设备、零部件</w:t>
+        <w:t>优进：从长远利益、根据国情，有选择进口紧缺的先进技术、关键设备、重要零部件</w:t>
       </w:r>
     </w:p>
     <w:p>
@@ -1021,7 +1407,7 @@
           <w:i w:val="0"/>
           <w:sz w:val="22"/>
         </w:rPr>
-        <w:t>优出：出口高附加值产品 + 推动“全产业链出口”(产品+技术+服务)</w:t>
+        <w:t>优出：不只出口高档次高附加值产品，还推动产品+技术+服务的“全产业链出口”</w:t>
       </w:r>
     </w:p>
     <w:p>
@@ -1050,7 +1436,115 @@
           <w:color w:val="202020"/>
           <w:sz w:val="20"/>
         </w:rPr>
-        <w:t>Главное противопоставление. Раньше Китай — «сборочный цех» (прибыль у иностранцев). 优进优出 — ввозить и вывозить КАЧЕСТВЕННО, экспортируя всю цепочку, а не только сборку.</w:t>
+        <w:t>Главное противопоставление раздела. Раньше Китай — «сборочный цех»: оба конца (закупки и продажи) за границей, прибыль у иностранцев. 优进优出 — ввозить и вывозить КАЧЕСТВЕННО, экспортируя всю цепочку.</w:t>
+      </w:r>
+    </w:p>
+    <w:p>
+      <w:pPr>
+        <w:spacing w:before="160" w:after="40"/>
+      </w:pPr>
+      <w:r>
+        <w:rPr>
+          <w:rFonts w:ascii="Calibri" w:hAnsi="Calibri" w:eastAsia="Microsoft YaHei"/>
+          <w:b/>
+          <w:i w:val="0"/>
+          <w:color w:val="B03010"/>
+          <w:sz w:val="25"/>
+        </w:rPr>
+        <w:t>十四五新业态 (новые форматы)</w:t>
+      </w:r>
+    </w:p>
+    <w:p>
+      <w:pPr>
+        <w:pStyle w:val="ListBullet"/>
+        <w:spacing w:after="20"/>
+        <w:ind w:left="312"/>
+      </w:pPr>
+      <w:r>
+        <w:rPr>
+          <w:rFonts w:ascii="Calibri" w:hAnsi="Calibri" w:eastAsia="Microsoft YaHei"/>
+          <w:b w:val="0"/>
+          <w:i w:val="0"/>
+          <w:sz w:val="22"/>
+        </w:rPr>
+        <w:t>跨境电商：网上跨国买卖(Alibaba/Amazon)；优势=全球准入·低成本高效·多样化定制·便捷支付物流</w:t>
+      </w:r>
+    </w:p>
+    <w:p>
+      <w:pPr>
+        <w:pStyle w:val="ListBullet"/>
+        <w:spacing w:after="20"/>
+        <w:ind w:left="312"/>
+      </w:pPr>
+      <w:r>
+        <w:rPr>
+          <w:rFonts w:ascii="Calibri" w:hAnsi="Calibri" w:eastAsia="Microsoft YaHei"/>
+          <w:b w:val="0"/>
+          <w:i w:val="0"/>
+          <w:sz w:val="22"/>
+        </w:rPr>
+        <w:t>服务贸易：传统(旅游·运输)+知识密集(金融·知识产权)+中国特色(文化·中医药)</w:t>
+      </w:r>
+    </w:p>
+    <w:p>
+      <w:pPr>
+        <w:pStyle w:val="ListBullet"/>
+        <w:spacing w:after="20"/>
+        <w:ind w:left="312"/>
+      </w:pPr>
+      <w:r>
+        <w:rPr>
+          <w:rFonts w:ascii="Calibri" w:hAnsi="Calibri" w:eastAsia="Microsoft YaHei"/>
+          <w:b w:val="0"/>
+          <w:i w:val="0"/>
+          <w:sz w:val="22"/>
+        </w:rPr>
+        <w:t>数字贸易：以数据为关键生产要素、数字服务为核心；降成本、促供应链全球化</w:t>
+      </w:r>
+    </w:p>
+    <w:p>
+      <w:pPr>
+        <w:pStyle w:val="ListBullet"/>
+        <w:spacing w:after="20"/>
+        <w:ind w:left="312"/>
+      </w:pPr>
+      <w:r>
+        <w:rPr>
+          <w:rFonts w:ascii="Calibri" w:hAnsi="Calibri" w:eastAsia="Microsoft YaHei"/>
+          <w:b w:val="0"/>
+          <w:i w:val="0"/>
+          <w:sz w:val="22"/>
+        </w:rPr>
+        <w:t>成就：中国发明专利超400万件(全球第一)；生成式AI发明世界第一；《黑神话:悟空》登Steam榜首</w:t>
+      </w:r>
+    </w:p>
+    <w:p>
+      <w:pPr>
+        <w:spacing w:before="60" w:after="140"/>
+        <w:shd w:val="clear" w:color="auto" w:fill="EAF3EC"/>
+        <w:pBdr>
+          <w:left w:val="single" w:sz="20" w:space="8" w:color="1A4D2E"/>
+        </w:pBdr>
+      </w:pPr>
+      <w:r>
+        <w:rPr>
+          <w:rFonts w:ascii="Calibri" w:hAnsi="Calibri" w:eastAsia="Microsoft YaHei"/>
+          <w:b/>
+          <w:i w:val="0"/>
+          <w:color w:val="1A4D2E"/>
+          <w:sz w:val="20"/>
+        </w:rPr>
+        <w:t xml:space="preserve">💡 </w:t>
+      </w:r>
+      <w:r>
+        <w:rPr>
+          <w:rFonts w:ascii="Calibri" w:hAnsi="Calibri" w:eastAsia="Microsoft YaHei"/>
+          <w:b w:val="0"/>
+          <w:i w:val="0"/>
+          <w:color w:val="202020"/>
+          <w:sz w:val="20"/>
+        </w:rPr>
+        <w:t>十四五 = эпоха «高质量发展» и «三个变革» (качества/драйверов/эффективности). Различай три термина: 跨境电商 — онлайн-торговля между странами; 服务贸易 — торговля услугами; 数字贸易 — шире всего, ядро — ДАННЫЕ как фактор производства.</w:t>
       </w:r>
     </w:p>
     <w:p>
@@ -1099,7 +1593,7 @@
           <w:i w:val="0"/>
           <w:sz w:val="22"/>
         </w:rPr>
-        <w:t>内涵(3)：提质量信誉 + 优化结构(高附加值) + 创名牌</w:t>
+        <w:t>背景：质量成为国际市场竞争取胜的决定性因素（面临技术壁垒、资源浪费）</w:t>
       </w:r>
     </w:p>
     <w:p>
@@ -1115,7 +1609,23 @@
           <w:i w:val="0"/>
           <w:sz w:val="22"/>
         </w:rPr>
-        <w:t>措施(5)：质量立法 · 提科技含量 · 接轨国际标准 · 名牌战略 · 全面质量管理</w:t>
+        <w:t>内涵(3)：提高质量和信誉 + 优化出口结构(高附加值·高技术含量) + 创立名牌</w:t>
+      </w:r>
+    </w:p>
+    <w:p>
+      <w:pPr>
+        <w:pStyle w:val="ListBullet"/>
+        <w:spacing w:after="20"/>
+        <w:ind w:left="312"/>
+      </w:pPr>
+      <w:r>
+        <w:rPr>
+          <w:rFonts w:ascii="Calibri" w:hAnsi="Calibri" w:eastAsia="Microsoft YaHei"/>
+          <w:b w:val="0"/>
+          <w:i w:val="0"/>
+          <w:sz w:val="22"/>
+        </w:rPr>
+        <w:t>措施(5)：质量立法执法 · 提高科技含量 · 推行接轨国际标准的质量管理体系 · 名牌战略 · 加强全面质量管理(TQM)</w:t>
       </w:r>
     </w:p>
     <w:p>
@@ -1144,7 +1654,7 @@
           <w:color w:val="202020"/>
           <w:sz w:val="20"/>
         </w:rPr>
-        <w:t>Качество = решающий фактор конкуренции. Структура ответа: «内涵(3)+措施(5)».</w:t>
+        <w:t>Качество = решающий фактор конкуренции. Структура ответа: «背景 + 内涵(3) + 措施(5)». 接轨国际标准 = состыковаться с междунар. стандартами (напр. ISO).</w:t>
       </w:r>
     </w:p>
     <w:p>
@@ -1188,7 +1698,7 @@
           <w:i w:val="0"/>
           <w:sz w:val="22"/>
         </w:rPr>
-        <w:t>推动高新技术产品出口，培育竞争力强的企业</w:t>
+        <w:t>背景：进入知识经济时代；高附加值、高技术产品重要性持续提升</w:t>
       </w:r>
     </w:p>
     <w:p>
@@ -1204,7 +1714,23 @@
           <w:i w:val="0"/>
           <w:sz w:val="22"/>
         </w:rPr>
-        <w:t>用高新技术改造传统出口产业，提高其技术含量和附加值</w:t>
+        <w:t>做法1：推动高新技术产品出口，培育竞争力强、附加值高、规模大的企业</w:t>
+      </w:r>
+    </w:p>
+    <w:p>
+      <w:pPr>
+        <w:pStyle w:val="ListBullet"/>
+        <w:spacing w:after="20"/>
+        <w:ind w:left="312"/>
+      </w:pPr>
+      <w:r>
+        <w:rPr>
+          <w:rFonts w:ascii="Calibri" w:hAnsi="Calibri" w:eastAsia="Microsoft YaHei"/>
+          <w:b w:val="0"/>
+          <w:i w:val="0"/>
+          <w:sz w:val="22"/>
+        </w:rPr>
+        <w:t>做法2：用高新技术改造传统出口产业，提高其技术含量和附加值</w:t>
       </w:r>
     </w:p>
     <w:p>
@@ -1233,7 +1759,7 @@
           <w:color w:val="202020"/>
           <w:sz w:val="20"/>
         </w:rPr>
-        <w:t>Две стороны: РАЗВИВАТЬ новое (хайтек) + МОДЕРНИЗИРОВАТЬ старое. Идёт в паре с «以质取胜».</w:t>
+        <w:t>Две стороны: РАЗВИВАТЬ новое (хайтек) + МОДЕРНИЗИРОВАТЬ старое. Идёт в паре с «以质取胜»: качество достигается через технологии.</w:t>
       </w:r>
     </w:p>
     <w:p>
@@ -1277,7 +1803,23 @@
           <w:i w:val="0"/>
           <w:sz w:val="22"/>
         </w:rPr>
-        <w:t>四大传统市场：港澳 · 日本 · 美国 · 欧盟（过度集中→有风险）</w:t>
+        <w:t>提出原因：任何市场容量有限；扩大规模、优化结构需市场拓展作保证 → 市场分散和多元化</w:t>
+      </w:r>
+    </w:p>
+    <w:p>
+      <w:pPr>
+        <w:pStyle w:val="ListBullet"/>
+        <w:spacing w:after="20"/>
+        <w:ind w:left="312"/>
+      </w:pPr>
+      <w:r>
+        <w:rPr>
+          <w:rFonts w:ascii="Calibri" w:hAnsi="Calibri" w:eastAsia="Microsoft YaHei"/>
+          <w:b w:val="0"/>
+          <w:i w:val="0"/>
+          <w:sz w:val="22"/>
+        </w:rPr>
+        <w:t>格局演变：四大传统市场=港澳·日本·美国·欧盟；高度集中于发达国家和港澳 → 约束增长、环境不稳定</w:t>
       </w:r>
     </w:p>
     <w:p>
@@ -1308,7 +1850,7 @@
           <w:i w:val="0"/>
           <w:sz w:val="22"/>
         </w:rPr>
-        <w:t>减少贸易摩擦、规避风险</w:t>
+        <w:t>减少贸易摩擦、规避风险（摆脱对个别市场过分依赖）</w:t>
       </w:r>
     </w:p>
     <w:p>
@@ -1324,7 +1866,7 @@
           <w:i w:val="0"/>
           <w:sz w:val="22"/>
         </w:rPr>
-        <w:t>出口持续稳定发展（避反倾销）</w:t>
+        <w:t>出口持续健康稳定发展（轻纺常遭反倾销→需开辟新市场分流）</w:t>
       </w:r>
     </w:p>
     <w:p>
@@ -1340,7 +1882,7 @@
           <w:i w:val="0"/>
           <w:sz w:val="22"/>
         </w:rPr>
-        <w:t>争取有利贸易条件（防买方垄断压价）</w:t>
+        <w:t>争取有利贸易条件（避免买方垄断压低我国出口价格）</w:t>
       </w:r>
     </w:p>
     <w:p>
@@ -1356,7 +1898,7 @@
           <w:i w:val="0"/>
           <w:sz w:val="22"/>
         </w:rPr>
-        <w:t>提升在国际分工中的地位（避免被锁在低端）</w:t>
+        <w:t>全面参与国际分工、提升地位（避免被固化在低层次劳动密集型环节）</w:t>
       </w:r>
     </w:p>
     <w:p>
@@ -1371,7 +1913,7 @@
           <w:color w:val="B03010"/>
           <w:sz w:val="25"/>
         </w:rPr>
-        <w:t>四类市场对策</w:t>
+        <w:t>四类市场对策 (4 рынка = 4 глагола)</w:t>
       </w:r>
     </w:p>
     <w:p>
@@ -1387,7 +1929,7 @@
           <w:i w:val="0"/>
           <w:sz w:val="22"/>
         </w:rPr>
-        <w:t>发达国家市场——深度开发(资金技术来源)，扩大水平分工</w:t>
+        <w:t>发达国家——深度开发：市场大、是资金/技术/物资来源；提技术含量、扩大水平分工</w:t>
       </w:r>
     </w:p>
     <w:p>
@@ -1403,7 +1945,7 @@
           <w:i w:val="0"/>
           <w:sz w:val="22"/>
         </w:rPr>
-        <w:t>亚洲市场——稳定扩大(东盟·韩国·香港转口)</w:t>
+        <w:t>亚洲——稳定扩大：东盟·韩国重要伙伴(已签自贸区)；香港=最重要转口市场</w:t>
       </w:r>
     </w:p>
     <w:p>
@@ -1419,7 +1961,7 @@
           <w:i w:val="0"/>
           <w:sz w:val="22"/>
         </w:rPr>
-        <w:t>非洲拉美——开拓(适销对路+综合方式)</w:t>
+        <w:t>非洲·拉美——开拓：潜力大、商品档次适配；做市场调研，出口+援助+投资+承包+劳务综合开拓</w:t>
       </w:r>
     </w:p>
     <w:p>
@@ -1435,7 +1977,7 @@
           <w:i w:val="0"/>
           <w:sz w:val="22"/>
         </w:rPr>
-        <w:t>中亚东欧——扩大(资源+相邻+互补)</w:t>
+        <w:t>中亚·东欧——扩大：资源丰富、与中亚相邻、互补性强；挑战=西方竞争、质量价格待改进</w:t>
       </w:r>
     </w:p>
     <w:p>
@@ -1464,7 +2006,7 @@
           <w:color w:val="202020"/>
           <w:sz w:val="20"/>
         </w:rPr>
-        <w:t>4 рынка = 4 глагола: развитые «углублять», Азия «стабилизировать», Африка/ЛатАм «осваивать», ЦентрАзия/ВостЕвропа «расширять».</w:t>
+        <w:t>4 рынка = 4 глагола: развитые «углублять» (深度开发), Азия «стабилизировать», Африка/ЛатАм «осваивать», ЦентрАзия/ВостЕвропа «расширять». 转口市场 — реэкспортный рынок (Гонконг). 互补性 — взаимодополняемость.</w:t>
       </w:r>
     </w:p>
     <w:p>
@@ -1508,7 +2050,7 @@
           <w:i w:val="0"/>
           <w:sz w:val="22"/>
         </w:rPr>
-        <w:t>引进先进技术和关键设备（四个“确保”：电子信息·能源交通·传统产业改造·农业现代化）</w:t>
+        <w:t>含义：根据国内生产、消费需要，对一定时期进口商品构成的战略规划</w:t>
       </w:r>
     </w:p>
     <w:p>
@@ -1524,7 +2066,22 @@
           <w:i w:val="0"/>
           <w:sz w:val="22"/>
         </w:rPr>
-        <w:t>确保重要资源进口（钢材·橡胶·铜·金刚石·白金…）</w:t>
+        <w:t>依据：以国民经济发展目标为依据（进口是国民经济重要组成部分）</w:t>
+      </w:r>
+    </w:p>
+    <w:p>
+      <w:pPr>
+        <w:spacing w:before="160" w:after="40"/>
+      </w:pPr>
+      <w:r>
+        <w:rPr>
+          <w:rFonts w:ascii="Calibri" w:hAnsi="Calibri" w:eastAsia="Microsoft YaHei"/>
+          <w:b/>
+          <w:i w:val="0"/>
+          <w:color w:val="B03010"/>
+          <w:sz w:val="25"/>
+        </w:rPr>
+        <w:t>主要内容(4)</w:t>
       </w:r>
     </w:p>
     <w:p>
@@ -1540,7 +2097,7 @@
           <w:i w:val="0"/>
           <w:sz w:val="22"/>
         </w:rPr>
-        <w:t>重视加工贸易物资进口（利用国外资源+国内劳动力，创汇、增就业）</w:t>
+        <w:t>引进先进技术和关键设备——四个“确保”：电子信息(先导产业)·能源交通(基础设施)·传统产业技术改造·农业现代化</w:t>
       </w:r>
     </w:p>
     <w:p>
@@ -1556,7 +2113,39 @@
           <w:i w:val="0"/>
           <w:sz w:val="22"/>
         </w:rPr>
-        <w:t>扩大生活必需品与一般消费品进口（如粮食→保国计民生）</w:t>
+        <w:t>确保重要资源进口——国内短缺物资：钢材·纸张·橡胶·铜·金刚石·白金等</w:t>
+      </w:r>
+    </w:p>
+    <w:p>
+      <w:pPr>
+        <w:pStyle w:val="ListBullet"/>
+        <w:spacing w:after="20"/>
+        <w:ind w:left="312"/>
+      </w:pPr>
+      <w:r>
+        <w:rPr>
+          <w:rFonts w:ascii="Calibri" w:hAnsi="Calibri" w:eastAsia="Microsoft YaHei"/>
+          <w:b w:val="0"/>
+          <w:i w:val="0"/>
+          <w:sz w:val="22"/>
+        </w:rPr>
+        <w:t>重视加工贸易物资进口——利用国外资源+国内劳动力优势，创汇增收、创造就业</w:t>
+      </w:r>
+    </w:p>
+    <w:p>
+      <w:pPr>
+        <w:pStyle w:val="ListBullet"/>
+        <w:spacing w:after="20"/>
+        <w:ind w:left="312"/>
+      </w:pPr>
+      <w:r>
+        <w:rPr>
+          <w:rFonts w:ascii="Calibri" w:hAnsi="Calibri" w:eastAsia="Microsoft YaHei"/>
+          <w:b w:val="0"/>
+          <w:i w:val="0"/>
+          <w:sz w:val="22"/>
+        </w:rPr>
+        <w:t>扩大生活必需品与一般消费品进口——如粮食：保国计民生、社会稳定</w:t>
       </w:r>
     </w:p>
     <w:p>
@@ -1585,7 +2174,7 @@
           <w:color w:val="202020"/>
           <w:sz w:val="20"/>
         </w:rPr>
-        <w:t>Импорт опирается на цели нархозяйства. 4 уровня: технологии → ресурсы → сырьё для давальческой торговли → потребительские товары.</w:t>
+        <w:t>Импорт опирается на цели нархозяйства. 4 уровня по приоритету: технологии/оборудование → важные ресурсы → сырьё для давальческой торговли → потребительские товары. 国计民生 = гос. дела и благосостояние народа.</w:t>
       </w:r>
     </w:p>
     <w:p>
@@ -1629,7 +2218,23 @@
           <w:i w:val="0"/>
           <w:sz w:val="22"/>
         </w:rPr>
-        <w:t>FTA：≥2国签协定，在WTO最惠国基础上进一步开放，分阶段取消关税与非关税壁垒</w:t>
+        <w:t>目的：拓展对外开放的广度和深度，提高开放型经济水平</w:t>
+      </w:r>
+    </w:p>
+    <w:p>
+      <w:pPr>
+        <w:pStyle w:val="ListBullet"/>
+        <w:spacing w:after="20"/>
+        <w:ind w:left="312"/>
+      </w:pPr>
+      <w:r>
+        <w:rPr>
+          <w:rFonts w:ascii="Calibri" w:hAnsi="Calibri" w:eastAsia="Microsoft YaHei"/>
+          <w:b w:val="0"/>
+          <w:i w:val="0"/>
+          <w:sz w:val="22"/>
+        </w:rPr>
+        <w:t>FTA定义：≥2国/地区签协定，在WTO最惠国基础上进一步开放，分阶段取消绝大部分货物关税与非关税壁垒</w:t>
       </w:r>
     </w:p>
     <w:p>
@@ -1661,7 +2266,39 @@
           <w:i w:val="0"/>
           <w:sz w:val="22"/>
         </w:rPr>
-        <w:t>FTA是WTO的“例外”：成员间互给优惠，不必给其他成员；是补充也是深度开放</w:t>
+        <w:t>与WTO关系：FTA是WTO的“例外”——成员间互给优惠、不必给其他成员；既是补充也是深度开放</w:t>
+      </w:r>
+    </w:p>
+    <w:p>
+      <w:pPr>
+        <w:pStyle w:val="ListBullet"/>
+        <w:spacing w:after="20"/>
+        <w:ind w:left="312"/>
+      </w:pPr>
+      <w:r>
+        <w:rPr>
+          <w:rFonts w:ascii="Calibri" w:hAnsi="Calibri" w:eastAsia="Microsoft YaHei"/>
+          <w:b w:val="0"/>
+          <w:i w:val="0"/>
+          <w:sz w:val="22"/>
+        </w:rPr>
+        <w:t>背景：多哈回合谈判缓慢 → 区域贸易安排兴起；截至2023全球自贸协定超350个</w:t>
+      </w:r>
+    </w:p>
+    <w:p>
+      <w:pPr>
+        <w:pStyle w:val="ListBullet"/>
+        <w:spacing w:after="20"/>
+        <w:ind w:left="312"/>
+      </w:pPr>
+      <w:r>
+        <w:rPr>
+          <w:rFonts w:ascii="Calibri" w:hAnsi="Calibri" w:eastAsia="Microsoft YaHei"/>
+          <w:b w:val="0"/>
+          <w:i w:val="0"/>
+          <w:sz w:val="22"/>
+        </w:rPr>
+        <w:t>中国：截至2023签22个自贸协定、29个自贸伙伴</w:t>
       </w:r>
     </w:p>
     <w:p>
@@ -1692,7 +2329,7 @@
           <w:i w:val="0"/>
           <w:sz w:val="22"/>
         </w:rPr>
-        <w:t>全球最大自贸区；2020签署、2022生效</w:t>
+        <w:t>全球最大自贸区(人口·规模·潜力最大)；2020签署、2022生效</w:t>
       </w:r>
     </w:p>
     <w:p>
@@ -1708,7 +2345,7 @@
           <w:i w:val="0"/>
           <w:sz w:val="22"/>
         </w:rPr>
-        <w:t>15国 = 东盟10国 + 中日韩澳新（注意：印度未加入）</w:t>
+        <w:t>15国 = 东盟10国 + 中·日·韩·澳·新（注意：印度未加入）</w:t>
       </w:r>
     </w:p>
     <w:p>
@@ -1724,7 +2361,23 @@
           <w:i w:val="0"/>
           <w:sz w:val="22"/>
         </w:rPr>
-        <w:t>覆盖≈全球30%人口·30%GDP·28%贸易；核心=区域内90%以上货物零关税</w:t>
+        <w:t>覆盖≈全球30%人口·30%GDP·28%贸易；核心=区域内90%以上货物逐步零关税</w:t>
+      </w:r>
+    </w:p>
+    <w:p>
+      <w:pPr>
+        <w:pStyle w:val="ListBullet"/>
+        <w:spacing w:after="20"/>
+        <w:ind w:left="312"/>
+      </w:pPr>
+      <w:r>
+        <w:rPr>
+          <w:rFonts w:ascii="Calibri" w:hAnsi="Calibri" w:eastAsia="Microsoft YaHei"/>
+          <w:b w:val="0"/>
+          <w:i w:val="0"/>
+          <w:sz w:val="22"/>
+        </w:rPr>
+        <w:t>成效：中间品贸易维持8万亿元高位；2022对成员国进出口同比+7.5%；提升价值链韧性</w:t>
       </w:r>
     </w:p>
     <w:p>
@@ -1753,7 +2406,7 @@
           <w:color w:val="202020"/>
           <w:sz w:val="20"/>
         </w:rPr>
-        <w:t>FTA — исключение из режима наибольшего благоприятствования (MFN). RCEP — крупнейшая ЗСТ: 15 стран (АСЕАН+КНР+Япония+Корея+Австралия+Н.Зеландия), Индии НЕТ. Подписан 2020, в силе с 2022, ≈30% мира.</w:t>
+        <w:t>FTA — исключение из режима наибольшего благоприятствования (MFN): внутри ЗСТ дают друг другу льготы, не распространяя на остальных. RCEP — крупнейшая ЗСТ: 15 стран (АСЕАН+КНР+Япония+Корея+Австралия+Н.Зеландия), Индии НЕТ. Подписан 2020, в силе с 2022, ≈30% мира; ключ — зануление пошлин на &gt;90% товаров.</w:t>
       </w:r>
     </w:p>
     <w:p>
@@ -2890,6 +3543,347 @@
           </w:p>
         </w:tc>
       </w:tr>
+      <w:tr>
+        <w:tc>
+          <w:tcPr>
+            <w:tcW w:type="dxa" w:w="3402"/>
+          </w:tcPr>
+          <w:p>
+            <w:r>
+              <w:rPr>
+                <w:rFonts w:ascii="Calibri" w:hAnsi="Calibri" w:eastAsia="Microsoft YaHei"/>
+                <w:b/>
+                <w:sz w:val="20"/>
+              </w:rPr>
+              <w:t>创汇</w:t>
+            </w:r>
+          </w:p>
+        </w:tc>
+        <w:tc>
+          <w:tcPr>
+            <w:tcW w:type="dxa" w:w="5102"/>
+          </w:tcPr>
+          <w:p>
+            <w:r>
+              <w:rPr>
+                <w:rFonts w:ascii="Calibri" w:hAnsi="Calibri" w:eastAsia="Microsoft YaHei"/>
+                <w:sz w:val="20"/>
+              </w:rPr>
+              <w:t>зарабатывать инвалюту (валютная выручка)</w:t>
+            </w:r>
+          </w:p>
+        </w:tc>
+      </w:tr>
+      <w:tr>
+        <w:tc>
+          <w:tcPr>
+            <w:tcW w:type="dxa" w:w="3402"/>
+          </w:tcPr>
+          <w:p>
+            <w:r>
+              <w:rPr>
+                <w:rFonts w:ascii="Calibri" w:hAnsi="Calibri" w:eastAsia="Microsoft YaHei"/>
+                <w:b/>
+                <w:sz w:val="20"/>
+              </w:rPr>
+              <w:t>信誉</w:t>
+            </w:r>
+          </w:p>
+        </w:tc>
+        <w:tc>
+          <w:tcPr>
+            <w:tcW w:type="dxa" w:w="5102"/>
+          </w:tcPr>
+          <w:p>
+            <w:r>
+              <w:rPr>
+                <w:rFonts w:ascii="Calibri" w:hAnsi="Calibri" w:eastAsia="Microsoft YaHei"/>
+                <w:sz w:val="20"/>
+              </w:rPr>
+              <w:t>репутация, кредит доверия</w:t>
+            </w:r>
+          </w:p>
+        </w:tc>
+      </w:tr>
+      <w:tr>
+        <w:tc>
+          <w:tcPr>
+            <w:tcW w:type="dxa" w:w="3402"/>
+          </w:tcPr>
+          <w:p>
+            <w:r>
+              <w:rPr>
+                <w:rFonts w:ascii="Calibri" w:hAnsi="Calibri" w:eastAsia="Microsoft YaHei"/>
+                <w:b/>
+                <w:sz w:val="20"/>
+              </w:rPr>
+              <w:t>接轨</w:t>
+            </w:r>
+          </w:p>
+        </w:tc>
+        <w:tc>
+          <w:tcPr>
+            <w:tcW w:type="dxa" w:w="5102"/>
+          </w:tcPr>
+          <w:p>
+            <w:r>
+              <w:rPr>
+                <w:rFonts w:ascii="Calibri" w:hAnsi="Calibri" w:eastAsia="Microsoft YaHei"/>
+                <w:sz w:val="20"/>
+              </w:rPr>
+              <w:t>состыковаться (с междунар. стандартами)</w:t>
+            </w:r>
+          </w:p>
+        </w:tc>
+      </w:tr>
+      <w:tr>
+        <w:tc>
+          <w:tcPr>
+            <w:tcW w:type="dxa" w:w="3402"/>
+          </w:tcPr>
+          <w:p>
+            <w:r>
+              <w:rPr>
+                <w:rFonts w:ascii="Calibri" w:hAnsi="Calibri" w:eastAsia="Microsoft YaHei"/>
+                <w:b/>
+                <w:sz w:val="20"/>
+              </w:rPr>
+              <w:t>全面质量管理</w:t>
+            </w:r>
+          </w:p>
+        </w:tc>
+        <w:tc>
+          <w:tcPr>
+            <w:tcW w:type="dxa" w:w="5102"/>
+          </w:tcPr>
+          <w:p>
+            <w:r>
+              <w:rPr>
+                <w:rFonts w:ascii="Calibri" w:hAnsi="Calibri" w:eastAsia="Microsoft YaHei"/>
+                <w:sz w:val="20"/>
+              </w:rPr>
+              <w:t>всеобщий менеджмент качества (TQM)</w:t>
+            </w:r>
+          </w:p>
+        </w:tc>
+      </w:tr>
+      <w:tr>
+        <w:tc>
+          <w:tcPr>
+            <w:tcW w:type="dxa" w:w="3402"/>
+          </w:tcPr>
+          <w:p>
+            <w:r>
+              <w:rPr>
+                <w:rFonts w:ascii="Calibri" w:hAnsi="Calibri" w:eastAsia="Microsoft YaHei"/>
+                <w:b/>
+                <w:sz w:val="20"/>
+              </w:rPr>
+              <w:t>技术壁垒</w:t>
+            </w:r>
+          </w:p>
+        </w:tc>
+        <w:tc>
+          <w:tcPr>
+            <w:tcW w:type="dxa" w:w="5102"/>
+          </w:tcPr>
+          <w:p>
+            <w:r>
+              <w:rPr>
+                <w:rFonts w:ascii="Calibri" w:hAnsi="Calibri" w:eastAsia="Microsoft YaHei"/>
+                <w:sz w:val="20"/>
+              </w:rPr>
+              <w:t>технические (нетарифные) барьеры</w:t>
+            </w:r>
+          </w:p>
+        </w:tc>
+      </w:tr>
+      <w:tr>
+        <w:tc>
+          <w:tcPr>
+            <w:tcW w:type="dxa" w:w="3402"/>
+          </w:tcPr>
+          <w:p>
+            <w:r>
+              <w:rPr>
+                <w:rFonts w:ascii="Calibri" w:hAnsi="Calibri" w:eastAsia="Microsoft YaHei"/>
+                <w:b/>
+                <w:sz w:val="20"/>
+              </w:rPr>
+              <w:t>高质量发展 / 三个变革</w:t>
+            </w:r>
+          </w:p>
+        </w:tc>
+        <w:tc>
+          <w:tcPr>
+            <w:tcW w:type="dxa" w:w="5102"/>
+          </w:tcPr>
+          <w:p>
+            <w:r>
+              <w:rPr>
+                <w:rFonts w:ascii="Calibri" w:hAnsi="Calibri" w:eastAsia="Microsoft YaHei"/>
+                <w:sz w:val="20"/>
+              </w:rPr>
+              <w:t>высококач. развитие / 3 преобразования</w:t>
+            </w:r>
+          </w:p>
+        </w:tc>
+      </w:tr>
+      <w:tr>
+        <w:tc>
+          <w:tcPr>
+            <w:tcW w:type="dxa" w:w="3402"/>
+          </w:tcPr>
+          <w:p>
+            <w:r>
+              <w:rPr>
+                <w:rFonts w:ascii="Calibri" w:hAnsi="Calibri" w:eastAsia="Microsoft YaHei"/>
+                <w:b/>
+                <w:sz w:val="20"/>
+              </w:rPr>
+              <w:t>新常态</w:t>
+            </w:r>
+          </w:p>
+        </w:tc>
+        <w:tc>
+          <w:tcPr>
+            <w:tcW w:type="dxa" w:w="5102"/>
+          </w:tcPr>
+          <w:p>
+            <w:r>
+              <w:rPr>
+                <w:rFonts w:ascii="Calibri" w:hAnsi="Calibri" w:eastAsia="Microsoft YaHei"/>
+                <w:sz w:val="20"/>
+              </w:rPr>
+              <w:t>«новая нормальность» экономики</w:t>
+            </w:r>
+          </w:p>
+        </w:tc>
+      </w:tr>
+      <w:tr>
+        <w:tc>
+          <w:tcPr>
+            <w:tcW w:type="dxa" w:w="3402"/>
+          </w:tcPr>
+          <w:p>
+            <w:r>
+              <w:rPr>
+                <w:rFonts w:ascii="Calibri" w:hAnsi="Calibri" w:eastAsia="Microsoft YaHei"/>
+                <w:b/>
+                <w:sz w:val="20"/>
+              </w:rPr>
+              <w:t>综合平衡</w:t>
+            </w:r>
+          </w:p>
+        </w:tc>
+        <w:tc>
+          <w:tcPr>
+            <w:tcW w:type="dxa" w:w="5102"/>
+          </w:tcPr>
+          <w:p>
+            <w:r>
+              <w:rPr>
+                <w:rFonts w:ascii="Calibri" w:hAnsi="Calibri" w:eastAsia="Microsoft YaHei"/>
+                <w:sz w:val="20"/>
+              </w:rPr>
+              <w:t>комплексная сбалансированность</w:t>
+            </w:r>
+          </w:p>
+        </w:tc>
+      </w:tr>
+      <w:tr>
+        <w:tc>
+          <w:tcPr>
+            <w:tcW w:type="dxa" w:w="3402"/>
+          </w:tcPr>
+          <w:p>
+            <w:r>
+              <w:rPr>
+                <w:rFonts w:ascii="Calibri" w:hAnsi="Calibri" w:eastAsia="Microsoft YaHei"/>
+                <w:b/>
+                <w:sz w:val="20"/>
+              </w:rPr>
+              <w:t>国计民生</w:t>
+            </w:r>
+          </w:p>
+        </w:tc>
+        <w:tc>
+          <w:tcPr>
+            <w:tcW w:type="dxa" w:w="5102"/>
+          </w:tcPr>
+          <w:p>
+            <w:r>
+              <w:rPr>
+                <w:rFonts w:ascii="Calibri" w:hAnsi="Calibri" w:eastAsia="Microsoft YaHei"/>
+                <w:sz w:val="20"/>
+              </w:rPr>
+              <w:t>гос. дела и благосостояние народа</w:t>
+            </w:r>
+          </w:p>
+        </w:tc>
+      </w:tr>
+      <w:tr>
+        <w:tc>
+          <w:tcPr>
+            <w:tcW w:type="dxa" w:w="3402"/>
+          </w:tcPr>
+          <w:p>
+            <w:r>
+              <w:rPr>
+                <w:rFonts w:ascii="Calibri" w:hAnsi="Calibri" w:eastAsia="Microsoft YaHei"/>
+                <w:b/>
+                <w:sz w:val="20"/>
+              </w:rPr>
+              <w:t>适销对路</w:t>
+            </w:r>
+          </w:p>
+        </w:tc>
+        <w:tc>
+          <w:tcPr>
+            <w:tcW w:type="dxa" w:w="5102"/>
+          </w:tcPr>
+          <w:p>
+            <w:r>
+              <w:rPr>
+                <w:rFonts w:ascii="Calibri" w:hAnsi="Calibri" w:eastAsia="Microsoft YaHei"/>
+                <w:sz w:val="20"/>
+              </w:rPr>
+              <w:t>ходовой, отвечающий спросу (товар)</w:t>
+            </w:r>
+          </w:p>
+        </w:tc>
+      </w:tr>
+      <w:tr>
+        <w:tc>
+          <w:tcPr>
+            <w:tcW w:type="dxa" w:w="3402"/>
+          </w:tcPr>
+          <w:p>
+            <w:r>
+              <w:rPr>
+                <w:rFonts w:ascii="Calibri" w:hAnsi="Calibri" w:eastAsia="Microsoft YaHei"/>
+                <w:b/>
+                <w:sz w:val="20"/>
+              </w:rPr>
+              <w:t>价值链韧性</w:t>
+            </w:r>
+          </w:p>
+        </w:tc>
+        <w:tc>
+          <w:tcPr>
+            <w:tcW w:type="dxa" w:w="5102"/>
+          </w:tcPr>
+          <w:p>
+            <w:r>
+              <w:rPr>
+                <w:rFonts w:ascii="Calibri" w:hAnsi="Calibri" w:eastAsia="Microsoft YaHei"/>
+                <w:sz w:val="20"/>
+              </w:rPr>
+              <w:t>устойчивость цепочек создания стоимости</w:t>
+            </w:r>
+          </w:p>
+        </w:tc>
+      </w:tr>
     </w:tbl>
     <w:p/>
     <w:p>

</xml_diff>